<commit_message>
row based matching logic changed
</commit_message>
<xml_diff>
--- a/docs/code.docx
+++ b/docs/code.docx
@@ -3451,7 +3451,7 @@
           <w:sz w:val="24"/>
           <w:szCs w:val="24"/>
         </w:rPr>
-        <w:t>The script should compare submission row i only with answer-key row i. Category and class points should only be considered after that row passes the timing margin rule.</w:t>
+        <w:t>The script should not require submission rows to be in answer-key order. It should first match submitted intervals to answer-key intervals using IoU, then apply the existing timing, category, class, points, and accuracy validations to each matched pair.</w:t>
       </w:r>
     </w:p>
     <w:p>
@@ -4713,313 +4713,275 @@
         <w:jc w:val="left"/>
         <w:rPr>
           <w:color w:val="2A6099"/>
-          <w:sz w:val="24"/>
-          <w:szCs w:val="24"/>
-        </w:rPr>
-      </w:pPr>
-      <w:r>
-        <w:rPr>
-          <w:color w:val="2A6099"/>
-          <w:sz w:val="24"/>
-          <w:szCs w:val="24"/>
-        </w:rPr>
-      </w:r>
-    </w:p>
-    <w:p>
-      <w:pPr>
-        <w:pStyle w:val="PreformattedText"/>
-        <w:bidi w:val="0"/>
-        <w:spacing w:before="0" w:after="0"/>
-        <w:jc w:val="left"/>
+          <w:sz w:val="28"/>
+          <w:szCs w:val="28"/>
+        </w:rPr>
+      </w:pPr>
+      <w:r>
         <w:rPr>
           <w:color w:val="2A6099"/>
           <w:sz w:val="28"/>
           <w:szCs w:val="28"/>
         </w:rPr>
-      </w:pPr>
-      <w:r>
+        <w:t>Matching Policy</w:t>
+      </w:r>
+    </w:p>
+    <w:p>
+      <w:pPr>
+        <w:pStyle w:val="PreformattedText"/>
+        <w:bidi w:val="0"/>
+        <w:spacing w:before="0" w:after="0"/>
+        <w:jc w:val="left"/>
+        <w:rPr>
+          <w:sz w:val="24"/>
+          <w:szCs w:val="24"/>
+        </w:rPr>
+      </w:pPr>
+      <w:r>
+        <w:rPr>
+          <w:sz w:val="24"/>
+          <w:szCs w:val="24"/>
+        </w:rPr>
+      </w:r>
+    </w:p>
+    <w:p>
+      <w:pPr>
+        <w:pStyle w:val="PreformattedText"/>
+        <w:bidi w:val="0"/>
+        <w:spacing w:before="0" w:after="0"/>
+        <w:jc w:val="left"/>
+        <w:rPr>
+          <w:sz w:val="24"/>
+          <w:szCs w:val="24"/>
+        </w:rPr>
+      </w:pPr>
+      <w:r>
+        <w:rPr>
+          <w:sz w:val="24"/>
+          <w:szCs w:val="24"/>
+        </w:rPr>
+        <w:t>Submission rows and answer-key rows are matched by interval overlap, not by row index. The grading script should compute IoU between valid submitted intervals and official answer-key intervals, then assign predictions to answer-key rows using the best available IoU matches.</w:t>
+      </w:r>
+    </w:p>
+    <w:p>
+      <w:pPr>
+        <w:pStyle w:val="PreformattedText"/>
+        <w:bidi w:val="0"/>
+        <w:spacing w:before="0" w:after="0"/>
+        <w:jc w:val="left"/>
+        <w:rPr>
+          <w:sz w:val="24"/>
+          <w:szCs w:val="24"/>
+        </w:rPr>
+      </w:pPr>
+      <w:r>
+        <w:rPr>
+          <w:sz w:val="24"/>
+          <w:szCs w:val="24"/>
+        </w:rPr>
+      </w:r>
+    </w:p>
+    <w:p>
+      <w:pPr>
+        <w:pStyle w:val="PreformattedText"/>
+        <w:bidi w:val="0"/>
+        <w:spacing w:before="0" w:after="0"/>
+        <w:jc w:val="left"/>
+        <w:rPr>
+          <w:sz w:val="24"/>
+          <w:szCs w:val="24"/>
+        </w:rPr>
+      </w:pPr>
+      <w:r>
+        <w:rPr>
+          <w:sz w:val="24"/>
+          <w:szCs w:val="24"/>
+        </w:rPr>
+        <w:t>Participants are not required to preserve chronological artifact order. Each submitted row can match at most one answer-key row, and each answer-key row can receive at most one submitted row. Higher-IoU pairs should be selected before lower-IoU pairs so the best interval matches are used first.</w:t>
+      </w:r>
+    </w:p>
+    <w:p>
+      <w:pPr>
+        <w:pStyle w:val="PreformattedText"/>
+        <w:bidi w:val="0"/>
+        <w:spacing w:before="0" w:after="0"/>
+        <w:jc w:val="left"/>
+        <w:rPr>
+          <w:sz w:val="24"/>
+          <w:szCs w:val="24"/>
+        </w:rPr>
+      </w:pPr>
+      <w:r>
+        <w:rPr>
+          <w:sz w:val="24"/>
+          <w:szCs w:val="24"/>
+        </w:rPr>
+      </w:r>
+    </w:p>
+    <w:p>
+      <w:pPr>
+        <w:pStyle w:val="PreformattedText"/>
+        <w:bidi w:val="0"/>
+        <w:spacing w:before="0" w:after="0"/>
+        <w:jc w:val="left"/>
+        <w:rPr>
+          <w:sz w:val="24"/>
+          <w:szCs w:val="24"/>
+        </w:rPr>
+      </w:pPr>
+      <w:r>
+        <w:rPr>
+          <w:sz w:val="24"/>
+          <w:szCs w:val="24"/>
+        </w:rPr>
+        <w:t>A fully blank submission row is allowed and should be treated as an unanswered row. Unanswered rows receive 0 interval points, 0 category points, and 0 class points.</w:t>
+      </w:r>
+    </w:p>
+    <w:p>
+      <w:pPr>
+        <w:pStyle w:val="PreformattedText"/>
+        <w:bidi w:val="0"/>
+        <w:spacing w:before="0" w:after="0"/>
+        <w:jc w:val="left"/>
+        <w:rPr>
+          <w:sz w:val="24"/>
+          <w:szCs w:val="24"/>
+        </w:rPr>
+      </w:pPr>
+      <w:r>
+        <w:rPr>
+          <w:sz w:val="24"/>
+          <w:szCs w:val="24"/>
+        </w:rPr>
+      </w:r>
+    </w:p>
+    <w:p>
+      <w:pPr>
+        <w:pStyle w:val="PreformattedText"/>
+        <w:bidi w:val="0"/>
+        <w:spacing w:before="0" w:after="0"/>
+        <w:jc w:val="left"/>
+        <w:rPr>
+          <w:sz w:val="24"/>
+          <w:szCs w:val="24"/>
+        </w:rPr>
+      </w:pPr>
+      <w:r>
+        <w:rPr>
+          <w:sz w:val="24"/>
+          <w:szCs w:val="24"/>
+        </w:rPr>
+        <w:t>For a nonblank row, the script should first validate that the submitted interval is usable. Valid submitted intervals should be considered for unordered IoU matching against all answer-key intervals. After a submitted interval is matched to an answer-key interval, the timing tolerance check, label validation, IoU-scaled interval points, category points, class points, and accuracy values should be computed for that matched pair.</w:t>
+      </w:r>
+    </w:p>
+    <w:p>
+      <w:pPr>
+        <w:pStyle w:val="PreformattedText"/>
+        <w:bidi w:val="0"/>
+        <w:spacing w:before="0" w:after="0"/>
+        <w:jc w:val="left"/>
+        <w:rPr>
+          <w:sz w:val="24"/>
+          <w:szCs w:val="24"/>
+        </w:rPr>
+      </w:pPr>
+      <w:r>
+        <w:rPr>
+          <w:sz w:val="24"/>
+          <w:szCs w:val="24"/>
+        </w:rPr>
+      </w:r>
+    </w:p>
+    <w:p>
+      <w:pPr>
+        <w:pStyle w:val="PreformattedText"/>
+        <w:bidi w:val="0"/>
+        <w:spacing w:before="0" w:after="0"/>
+        <w:jc w:val="left"/>
+        <w:rPr>
+          <w:sz w:val="24"/>
+          <w:szCs w:val="24"/>
+        </w:rPr>
+      </w:pPr>
+      <w:r>
+        <w:rPr>
+          <w:sz w:val="24"/>
+          <w:szCs w:val="24"/>
+        </w:rPr>
+      </w:r>
+    </w:p>
+    <w:p>
+      <w:pPr>
+        <w:pStyle w:val="PreformattedText"/>
+        <w:bidi w:val="0"/>
+        <w:spacing w:before="0" w:after="0"/>
+        <w:jc w:val="left"/>
+        <w:rPr>
+          <w:sz w:val="24"/>
+          <w:szCs w:val="24"/>
+        </w:rPr>
+      </w:pPr>
+      <w:r>
+        <w:rPr>
+          <w:sz w:val="24"/>
+          <w:szCs w:val="24"/>
+        </w:rPr>
+      </w:r>
+    </w:p>
+    <w:p>
+      <w:pPr>
+        <w:pStyle w:val="PreformattedText"/>
+        <w:bidi w:val="0"/>
+        <w:spacing w:before="0" w:after="0"/>
+        <w:jc w:val="left"/>
+        <w:rPr>
+          <w:sz w:val="24"/>
+          <w:szCs w:val="24"/>
+        </w:rPr>
+      </w:pPr>
+      <w:r>
+        <w:rPr>
+          <w:sz w:val="24"/>
+          <w:szCs w:val="24"/>
+        </w:rPr>
+      </w:r>
+    </w:p>
+    <w:p>
+      <w:pPr>
+        <w:pStyle w:val="PreformattedText"/>
+        <w:bidi w:val="0"/>
+        <w:spacing w:before="0" w:after="0"/>
+        <w:jc w:val="left"/>
+        <w:rPr>
+          <w:sz w:val="24"/>
+          <w:szCs w:val="24"/>
+        </w:rPr>
+      </w:pPr>
+      <w:r>
+        <w:rPr>
+          <w:sz w:val="24"/>
+          <w:szCs w:val="24"/>
+        </w:rPr>
+      </w:r>
+    </w:p>
+    <w:p>
+      <w:pPr>
+        <w:pStyle w:val="PreformattedText"/>
+        <w:bidi w:val="0"/>
+        <w:spacing w:before="0" w:after="0"/>
+        <w:jc w:val="left"/>
         <w:rPr>
           <w:color w:val="2A6099"/>
           <w:sz w:val="28"/>
           <w:szCs w:val="28"/>
         </w:rPr>
-        <w:t>Matching Policy</w:t>
-      </w:r>
-    </w:p>
-    <w:p>
-      <w:pPr>
-        <w:pStyle w:val="PreformattedText"/>
-        <w:bidi w:val="0"/>
-        <w:spacing w:before="0" w:after="0"/>
-        <w:jc w:val="left"/>
-        <w:rPr>
-          <w:sz w:val="24"/>
-          <w:szCs w:val="24"/>
-        </w:rPr>
-      </w:pPr>
-      <w:r>
-        <w:rPr>
-          <w:sz w:val="24"/>
-          <w:szCs w:val="24"/>
-        </w:rPr>
-      </w:r>
-    </w:p>
-    <w:p>
-      <w:pPr>
-        <w:pStyle w:val="PreformattedText"/>
-        <w:bidi w:val="0"/>
-        <w:spacing w:before="0" w:after="0"/>
-        <w:jc w:val="left"/>
-        <w:rPr>
-          <w:sz w:val="24"/>
-          <w:szCs w:val="24"/>
-        </w:rPr>
-      </w:pPr>
-      <w:r>
-        <w:rPr>
-          <w:sz w:val="24"/>
-          <w:szCs w:val="24"/>
-        </w:rPr>
-        <w:t>Submission rows and answer-key rows are compared by row index only. The grading script compares submission row i only with answer-key row i.</w:t>
-      </w:r>
-    </w:p>
-    <w:p>
-      <w:pPr>
-        <w:pStyle w:val="PreformattedText"/>
-        <w:bidi w:val="0"/>
-        <w:spacing w:before="0" w:after="0"/>
-        <w:jc w:val="left"/>
-        <w:rPr>
-          <w:sz w:val="24"/>
-          <w:szCs w:val="24"/>
-        </w:rPr>
-      </w:pPr>
-      <w:r>
-        <w:rPr>
-          <w:sz w:val="24"/>
-          <w:szCs w:val="24"/>
-        </w:rPr>
-      </w:r>
-    </w:p>
-    <w:p>
-      <w:pPr>
-        <w:pStyle w:val="PreformattedText"/>
-        <w:bidi w:val="0"/>
-        <w:spacing w:before="0" w:after="0"/>
-        <w:jc w:val="left"/>
-        <w:rPr>
-          <w:sz w:val="24"/>
-          <w:szCs w:val="24"/>
-        </w:rPr>
-      </w:pPr>
-      <w:r>
-        <w:rPr>
-          <w:sz w:val="24"/>
-          <w:szCs w:val="24"/>
-        </w:rPr>
-        <w:t>Participants are expected to preserve the same chronological artifact order as the official answer key. The script does not perform cross-row matching, global best-match assignment, or IoU-based row selection.</w:t>
-      </w:r>
-    </w:p>
-    <w:p>
-      <w:pPr>
-        <w:pStyle w:val="PreformattedText"/>
-        <w:bidi w:val="0"/>
-        <w:spacing w:before="0" w:after="0"/>
-        <w:jc w:val="left"/>
-        <w:rPr>
-          <w:sz w:val="24"/>
-          <w:szCs w:val="24"/>
-        </w:rPr>
-      </w:pPr>
-      <w:r>
-        <w:rPr>
-          <w:sz w:val="24"/>
-          <w:szCs w:val="24"/>
-        </w:rPr>
-      </w:r>
-    </w:p>
-    <w:p>
-      <w:pPr>
-        <w:pStyle w:val="PreformattedText"/>
-        <w:bidi w:val="0"/>
-        <w:spacing w:before="0" w:after="0"/>
-        <w:jc w:val="left"/>
-        <w:rPr>
-          <w:sz w:val="24"/>
-          <w:szCs w:val="24"/>
-        </w:rPr>
-      </w:pPr>
-      <w:r>
-        <w:rPr>
-          <w:sz w:val="24"/>
-          <w:szCs w:val="24"/>
-        </w:rPr>
-        <w:t>A fully blank submission row is allowed and should be treated as an unanswered row. Unanswered rows receive 0 interval points, 0 category points, and 0 class points.</w:t>
-      </w:r>
-    </w:p>
-    <w:p>
-      <w:pPr>
-        <w:pStyle w:val="PreformattedText"/>
-        <w:bidi w:val="0"/>
-        <w:spacing w:before="0" w:after="0"/>
-        <w:jc w:val="left"/>
-        <w:rPr>
-          <w:sz w:val="24"/>
-          <w:szCs w:val="24"/>
-        </w:rPr>
-      </w:pPr>
-      <w:r>
-        <w:rPr>
-          <w:sz w:val="24"/>
-          <w:szCs w:val="24"/>
-        </w:rPr>
-      </w:r>
-    </w:p>
-    <w:p>
-      <w:pPr>
-        <w:pStyle w:val="PreformattedText"/>
-        <w:bidi w:val="0"/>
-        <w:spacing w:before="0" w:after="0"/>
-        <w:jc w:val="left"/>
-        <w:rPr>
-          <w:sz w:val="24"/>
-          <w:szCs w:val="24"/>
-        </w:rPr>
-      </w:pPr>
-      <w:r>
-        <w:rPr>
-          <w:sz w:val="24"/>
-          <w:szCs w:val="24"/>
-        </w:rPr>
-        <w:t>For a nonblank row, the script should first validate the row, then compare its interval only with the corresponding answer-key row. If the timing check passes, IoU may be used only to scale interval points for that same row.</w:t>
-      </w:r>
-    </w:p>
-    <w:p>
-      <w:pPr>
-        <w:pStyle w:val="PreformattedText"/>
-        <w:bidi w:val="0"/>
-        <w:spacing w:before="0" w:after="0"/>
-        <w:jc w:val="left"/>
-        <w:rPr>
-          <w:sz w:val="24"/>
-          <w:szCs w:val="24"/>
-        </w:rPr>
-      </w:pPr>
-      <w:r>
-        <w:rPr>
-          <w:sz w:val="24"/>
-          <w:szCs w:val="24"/>
-        </w:rPr>
-      </w:r>
-    </w:p>
-    <w:p>
-      <w:pPr>
-        <w:pStyle w:val="PreformattedText"/>
-        <w:bidi w:val="0"/>
-        <w:spacing w:before="0" w:after="0"/>
-        <w:jc w:val="left"/>
-        <w:rPr>
-          <w:sz w:val="24"/>
-          <w:szCs w:val="24"/>
-        </w:rPr>
-      </w:pPr>
-      <w:r>
-        <w:rPr>
-          <w:sz w:val="24"/>
-          <w:szCs w:val="24"/>
-        </w:rPr>
-      </w:r>
-    </w:p>
-    <w:p>
-      <w:pPr>
-        <w:pStyle w:val="PreformattedText"/>
-        <w:bidi w:val="0"/>
-        <w:spacing w:before="0" w:after="0"/>
-        <w:jc w:val="left"/>
-        <w:rPr>
-          <w:sz w:val="24"/>
-          <w:szCs w:val="24"/>
-        </w:rPr>
-      </w:pPr>
-      <w:r>
-        <w:rPr>
-          <w:sz w:val="24"/>
-          <w:szCs w:val="24"/>
-        </w:rPr>
-      </w:r>
-    </w:p>
-    <w:p>
-      <w:pPr>
-        <w:pStyle w:val="PreformattedText"/>
-        <w:bidi w:val="0"/>
-        <w:spacing w:before="0" w:after="0"/>
-        <w:jc w:val="left"/>
-        <w:rPr>
-          <w:sz w:val="24"/>
-          <w:szCs w:val="24"/>
-        </w:rPr>
-      </w:pPr>
-      <w:r>
-        <w:rPr>
-          <w:sz w:val="24"/>
-          <w:szCs w:val="24"/>
-        </w:rPr>
-      </w:r>
-    </w:p>
-    <w:p>
-      <w:pPr>
-        <w:pStyle w:val="PreformattedText"/>
-        <w:bidi w:val="0"/>
-        <w:spacing w:before="0" w:after="0"/>
-        <w:jc w:val="left"/>
-        <w:rPr>
-          <w:sz w:val="24"/>
-          <w:szCs w:val="24"/>
-        </w:rPr>
-      </w:pPr>
-      <w:r>
-        <w:rPr>
-          <w:sz w:val="24"/>
-          <w:szCs w:val="24"/>
-        </w:rPr>
-      </w:r>
-    </w:p>
-    <w:p>
-      <w:pPr>
-        <w:pStyle w:val="PreformattedText"/>
-        <w:bidi w:val="0"/>
-        <w:spacing w:before="0" w:after="0"/>
-        <w:jc w:val="left"/>
-        <w:rPr>
-          <w:sz w:val="24"/>
-          <w:szCs w:val="24"/>
-        </w:rPr>
-      </w:pPr>
-      <w:r>
-        <w:rPr>
-          <w:sz w:val="24"/>
-          <w:szCs w:val="24"/>
-        </w:rPr>
-      </w:r>
-    </w:p>
-    <w:p>
-      <w:pPr>
-        <w:pStyle w:val="PreformattedText"/>
-        <w:bidi w:val="0"/>
-        <w:spacing w:before="0" w:after="0"/>
-        <w:jc w:val="left"/>
+      </w:pPr>
+      <w:r>
         <w:rPr>
           <w:color w:val="2A6099"/>
           <w:sz w:val="28"/>
           <w:szCs w:val="28"/>
         </w:rPr>
-      </w:pPr>
-      <w:r>
-        <w:rPr>
-          <w:color w:val="2A6099"/>
-          <w:sz w:val="28"/>
-          <w:szCs w:val="28"/>
-        </w:rPr>
         <w:t>Point Scoring</w:t>
       </w:r>
     </w:p>
@@ -5187,7 +5149,7 @@
           <w:sz w:val="24"/>
           <w:szCs w:val="24"/>
         </w:rPr>
-        <w:t>For each row that passes the timing margin rule against its corresponding answer-key row:</w:t>
+        <w:t>For each matched answer-key row that passes the timing margin rule:</w:t>
       </w:r>
     </w:p>
     <w:p>
@@ -5243,26 +5205,26 @@
           <w:sz w:val="24"/>
           <w:szCs w:val="24"/>
         </w:rPr>
-        <w:t>2. Add category points if the predicted category equals the official answer-key category for that row.</w:t>
-      </w:r>
-    </w:p>
-    <w:p>
-      <w:pPr>
-        <w:pStyle w:val="PreformattedText"/>
-        <w:bidi w:val="0"/>
-        <w:spacing w:before="0" w:after="0"/>
-        <w:jc w:val="left"/>
-        <w:rPr>
-          <w:sz w:val="24"/>
-          <w:szCs w:val="24"/>
-        </w:rPr>
-      </w:pPr>
-      <w:r>
-        <w:rPr>
-          <w:sz w:val="24"/>
-          <w:szCs w:val="24"/>
-        </w:rPr>
-        <w:t>3. Add class points if the predicted artifact class equals the official answer-key artifact class for that row.</w:t>
+        <w:t>2. Add category points if the matched prediction category equals the official answer-key category for that row.</w:t>
+      </w:r>
+    </w:p>
+    <w:p>
+      <w:pPr>
+        <w:pStyle w:val="PreformattedText"/>
+        <w:bidi w:val="0"/>
+        <w:spacing w:before="0" w:after="0"/>
+        <w:jc w:val="left"/>
+        <w:rPr>
+          <w:sz w:val="24"/>
+          <w:szCs w:val="24"/>
+        </w:rPr>
+      </w:pPr>
+      <w:r>
+        <w:rPr>
+          <w:sz w:val="24"/>
+          <w:szCs w:val="24"/>
+        </w:rPr>
+        <w:t>3. Add class points if the matched prediction artifact class equals the official answer-key artifact class for that row.</w:t>
       </w:r>
     </w:p>
     <w:p>
@@ -5979,42 +5941,6 @@
         <w:spacing w:before="0" w:after="0"/>
         <w:jc w:val="left"/>
         <w:rPr>
-          <w:sz w:val="24"/>
-          <w:szCs w:val="24"/>
-        </w:rPr>
-      </w:pPr>
-      <w:r>
-        <w:rPr>
-          <w:sz w:val="24"/>
-          <w:szCs w:val="24"/>
-        </w:rPr>
-      </w:r>
-    </w:p>
-    <w:p>
-      <w:pPr>
-        <w:pStyle w:val="PreformattedText"/>
-        <w:bidi w:val="0"/>
-        <w:spacing w:before="0" w:after="0"/>
-        <w:jc w:val="left"/>
-        <w:rPr>
-          <w:sz w:val="24"/>
-          <w:szCs w:val="24"/>
-        </w:rPr>
-      </w:pPr>
-      <w:r>
-        <w:rPr>
-          <w:sz w:val="24"/>
-          <w:szCs w:val="24"/>
-        </w:rPr>
-      </w:r>
-    </w:p>
-    <w:p>
-      <w:pPr>
-        <w:pStyle w:val="PreformattedText"/>
-        <w:bidi w:val="0"/>
-        <w:spacing w:before="0" w:after="0"/>
-        <w:jc w:val="left"/>
-        <w:rPr>
           <w:color w:val="2A6099"/>
           <w:sz w:val="28"/>
           <w:szCs w:val="28"/>
@@ -6683,7 +6609,7 @@
           <w:sz w:val="24"/>
           <w:szCs w:val="24"/>
         </w:rPr>
-        <w:t>Accuracy should be reported using row-based measures.</w:t>
+        <w:t>Accuracy should be reported using answer-key-row-based measures after unordered interval matching.</w:t>
       </w:r>
     </w:p>
     <w:p>
@@ -6794,45 +6720,45 @@
           <w:sz w:val="24"/>
           <w:szCs w:val="24"/>
         </w:rPr>
-        <w:t>- Interval Accuracy = the row’s IoU-based interval correctness value if the row passes the timing tolerance check, otherwise 0</w:t>
-      </w:r>
-    </w:p>
-    <w:p>
-      <w:pPr>
-        <w:pStyle w:val="PreformattedText"/>
-        <w:bidi w:val="0"/>
-        <w:spacing w:before="0" w:after="0"/>
-        <w:jc w:val="left"/>
-        <w:rPr>
-          <w:sz w:val="24"/>
-          <w:szCs w:val="24"/>
-        </w:rPr>
-      </w:pPr>
-      <w:r>
-        <w:rPr>
-          <w:sz w:val="24"/>
-          <w:szCs w:val="24"/>
-        </w:rPr>
-        <w:t>- Category Accuracy = 1 if the predicted artifact category matches the answer-key row, otherwise 0</w:t>
-      </w:r>
-    </w:p>
-    <w:p>
-      <w:pPr>
-        <w:pStyle w:val="PreformattedText"/>
-        <w:bidi w:val="0"/>
-        <w:spacing w:before="0" w:after="0"/>
-        <w:jc w:val="left"/>
-        <w:rPr>
-          <w:sz w:val="24"/>
-          <w:szCs w:val="24"/>
-        </w:rPr>
-      </w:pPr>
-      <w:r>
-        <w:rPr>
-          <w:sz w:val="24"/>
-          <w:szCs w:val="24"/>
-        </w:rPr>
-        <w:t>- Artifact Accuracy = 1 if the predicted artifact class matches the answer-key row, otherwise 0</w:t>
+        <w:t>- Interval Accuracy = the matched prediction’s IoU-based interval correctness value if the matched pair passes the timing tolerance check, otherwise 0</w:t>
+      </w:r>
+    </w:p>
+    <w:p>
+      <w:pPr>
+        <w:pStyle w:val="PreformattedText"/>
+        <w:bidi w:val="0"/>
+        <w:spacing w:before="0" w:after="0"/>
+        <w:jc w:val="left"/>
+        <w:rPr>
+          <w:sz w:val="24"/>
+          <w:szCs w:val="24"/>
+        </w:rPr>
+      </w:pPr>
+      <w:r>
+        <w:rPr>
+          <w:sz w:val="24"/>
+          <w:szCs w:val="24"/>
+        </w:rPr>
+        <w:t>- Category Accuracy = 1 if the matched prediction artifact category matches the answer-key row, otherwise 0</w:t>
+      </w:r>
+    </w:p>
+    <w:p>
+      <w:pPr>
+        <w:pStyle w:val="PreformattedText"/>
+        <w:bidi w:val="0"/>
+        <w:spacing w:before="0" w:after="0"/>
+        <w:jc w:val="left"/>
+        <w:rPr>
+          <w:sz w:val="24"/>
+          <w:szCs w:val="24"/>
+        </w:rPr>
+      </w:pPr>
+      <w:r>
+        <w:rPr>
+          <w:sz w:val="24"/>
+          <w:szCs w:val="24"/>
+        </w:rPr>
+        <w:t>- Artifact Accuracy = 1 if the matched prediction artifact class matches the answer-key row, otherwise 0</w:t>
       </w:r>
     </w:p>
     <w:p>
@@ -7241,7 +7167,7 @@
           <w:sz w:val="24"/>
           <w:szCs w:val="24"/>
         </w:rPr>
-        <w:t>- both are derived from the same row comparison</w:t>
+        <w:t>- both are derived from the same matched prediction and answer-key row comparison</w:t>
       </w:r>
     </w:p>
     <w:p>
@@ -7908,28 +7834,10 @@
       </w:pPr>
       <w:r>
         <w:rPr>
-          <w:sz w:val="24"/>
-          <w:szCs w:val="24"/>
-        </w:rPr>
-      </w:r>
-    </w:p>
-    <w:p>
-      <w:pPr>
-        <w:pStyle w:val="PreformattedText"/>
-        <w:bidi w:val="0"/>
-        <w:spacing w:before="0" w:after="0"/>
-        <w:jc w:val="left"/>
-        <w:rPr>
           <w:color w:val="2A6099"/>
           <w:sz w:val="28"/>
           <w:szCs w:val="28"/>
         </w:rPr>
-      </w:pPr>
-      <w:r>
-        <w:rPr>
-          <w:sz w:val="24"/>
-          <w:szCs w:val="24"/>
-        </w:rPr>
       </w:r>
     </w:p>
     <w:p>
@@ -7946,28 +7854,10 @@
       </w:pPr>
       <w:r>
         <w:rPr>
-          <w:sz w:val="24"/>
-          <w:szCs w:val="24"/>
-        </w:rPr>
-      </w:r>
-    </w:p>
-    <w:p>
-      <w:pPr>
-        <w:pStyle w:val="PreformattedText"/>
-        <w:bidi w:val="0"/>
-        <w:spacing w:before="0" w:after="0"/>
-        <w:jc w:val="left"/>
-        <w:rPr>
           <w:color w:val="2A6099"/>
           <w:sz w:val="28"/>
           <w:szCs w:val="28"/>
         </w:rPr>
-      </w:pPr>
-      <w:r>
-        <w:rPr>
-          <w:sz w:val="24"/>
-          <w:szCs w:val="24"/>
-        </w:rPr>
       </w:r>
     </w:p>
     <w:p>
@@ -7984,28 +7874,10 @@
       </w:pPr>
       <w:r>
         <w:rPr>
-          <w:sz w:val="24"/>
-          <w:szCs w:val="24"/>
-        </w:rPr>
-      </w:r>
-    </w:p>
-    <w:p>
-      <w:pPr>
-        <w:pStyle w:val="PreformattedText"/>
-        <w:bidi w:val="0"/>
-        <w:spacing w:before="0" w:after="0"/>
-        <w:jc w:val="left"/>
-        <w:rPr>
           <w:color w:val="2A6099"/>
           <w:sz w:val="28"/>
           <w:szCs w:val="28"/>
         </w:rPr>
-      </w:pPr>
-      <w:r>
-        <w:rPr>
-          <w:sz w:val="24"/>
-          <w:szCs w:val="24"/>
-        </w:rPr>
       </w:r>
     </w:p>
     <w:p>
@@ -8022,28 +7894,10 @@
       </w:pPr>
       <w:r>
         <w:rPr>
-          <w:sz w:val="24"/>
-          <w:szCs w:val="24"/>
-        </w:rPr>
-      </w:r>
-    </w:p>
-    <w:p>
-      <w:pPr>
-        <w:pStyle w:val="PreformattedText"/>
-        <w:bidi w:val="0"/>
-        <w:spacing w:before="0" w:after="0"/>
-        <w:jc w:val="left"/>
-        <w:rPr>
           <w:color w:val="2A6099"/>
           <w:sz w:val="28"/>
           <w:szCs w:val="28"/>
         </w:rPr>
-      </w:pPr>
-      <w:r>
-        <w:rPr>
-          <w:sz w:val="24"/>
-          <w:szCs w:val="24"/>
-        </w:rPr>
       </w:r>
     </w:p>
     <w:p>
@@ -8060,28 +7914,10 @@
       </w:pPr>
       <w:r>
         <w:rPr>
-          <w:sz w:val="24"/>
-          <w:szCs w:val="24"/>
-        </w:rPr>
-      </w:r>
-    </w:p>
-    <w:p>
-      <w:pPr>
-        <w:pStyle w:val="PreformattedText"/>
-        <w:bidi w:val="0"/>
-        <w:spacing w:before="0" w:after="0"/>
-        <w:jc w:val="left"/>
-        <w:rPr>
           <w:color w:val="2A6099"/>
           <w:sz w:val="28"/>
           <w:szCs w:val="28"/>
         </w:rPr>
-      </w:pPr>
-      <w:r>
-        <w:rPr>
-          <w:sz w:val="24"/>
-          <w:szCs w:val="24"/>
-        </w:rPr>
       </w:r>
     </w:p>
     <w:p>
@@ -8098,28 +7934,10 @@
       </w:pPr>
       <w:r>
         <w:rPr>
-          <w:sz w:val="24"/>
-          <w:szCs w:val="24"/>
-        </w:rPr>
-      </w:r>
-    </w:p>
-    <w:p>
-      <w:pPr>
-        <w:pStyle w:val="PreformattedText"/>
-        <w:bidi w:val="0"/>
-        <w:spacing w:before="0" w:after="0"/>
-        <w:jc w:val="left"/>
-        <w:rPr>
           <w:color w:val="2A6099"/>
           <w:sz w:val="28"/>
           <w:szCs w:val="28"/>
         </w:rPr>
-      </w:pPr>
-      <w:r>
-        <w:rPr>
-          <w:sz w:val="24"/>
-          <w:szCs w:val="24"/>
-        </w:rPr>
       </w:r>
     </w:p>
     <w:p>
@@ -8136,28 +7954,10 @@
       </w:pPr>
       <w:r>
         <w:rPr>
-          <w:sz w:val="24"/>
-          <w:szCs w:val="24"/>
-        </w:rPr>
-      </w:r>
-    </w:p>
-    <w:p>
-      <w:pPr>
-        <w:pStyle w:val="PreformattedText"/>
-        <w:bidi w:val="0"/>
-        <w:spacing w:before="0" w:after="0"/>
-        <w:jc w:val="left"/>
-        <w:rPr>
           <w:color w:val="2A6099"/>
           <w:sz w:val="28"/>
           <w:szCs w:val="28"/>
         </w:rPr>
-      </w:pPr>
-      <w:r>
-        <w:rPr>
-          <w:sz w:val="24"/>
-          <w:szCs w:val="24"/>
-        </w:rPr>
       </w:r>
     </w:p>
     <w:p>
@@ -8174,28 +7974,10 @@
       </w:pPr>
       <w:r>
         <w:rPr>
-          <w:sz w:val="24"/>
-          <w:szCs w:val="24"/>
-        </w:rPr>
-      </w:r>
-    </w:p>
-    <w:p>
-      <w:pPr>
-        <w:pStyle w:val="PreformattedText"/>
-        <w:bidi w:val="0"/>
-        <w:spacing w:before="0" w:after="0"/>
-        <w:jc w:val="left"/>
-        <w:rPr>
           <w:color w:val="2A6099"/>
           <w:sz w:val="28"/>
           <w:szCs w:val="28"/>
         </w:rPr>
-      </w:pPr>
-      <w:r>
-        <w:rPr>
-          <w:sz w:val="24"/>
-          <w:szCs w:val="24"/>
-        </w:rPr>
       </w:r>
     </w:p>
     <w:p>
@@ -8212,28 +7994,10 @@
       </w:pPr>
       <w:r>
         <w:rPr>
-          <w:sz w:val="24"/>
-          <w:szCs w:val="24"/>
-        </w:rPr>
-      </w:r>
-    </w:p>
-    <w:p>
-      <w:pPr>
-        <w:pStyle w:val="PreformattedText"/>
-        <w:bidi w:val="0"/>
-        <w:spacing w:before="0" w:after="0"/>
-        <w:jc w:val="left"/>
-        <w:rPr>
           <w:color w:val="2A6099"/>
           <w:sz w:val="28"/>
           <w:szCs w:val="28"/>
         </w:rPr>
-      </w:pPr>
-      <w:r>
-        <w:rPr>
-          <w:sz w:val="24"/>
-          <w:szCs w:val="24"/>
-        </w:rPr>
       </w:r>
     </w:p>
     <w:p>
@@ -8250,28 +8014,10 @@
       </w:pPr>
       <w:r>
         <w:rPr>
-          <w:sz w:val="24"/>
-          <w:szCs w:val="24"/>
-        </w:rPr>
-      </w:r>
-    </w:p>
-    <w:p>
-      <w:pPr>
-        <w:pStyle w:val="PreformattedText"/>
-        <w:bidi w:val="0"/>
-        <w:spacing w:before="0" w:after="0"/>
-        <w:jc w:val="left"/>
-        <w:rPr>
           <w:color w:val="2A6099"/>
           <w:sz w:val="28"/>
           <w:szCs w:val="28"/>
         </w:rPr>
-      </w:pPr>
-      <w:r>
-        <w:rPr>
-          <w:sz w:val="24"/>
-          <w:szCs w:val="24"/>
-        </w:rPr>
       </w:r>
     </w:p>
     <w:p>
@@ -8288,29 +8034,110 @@
       </w:pPr>
       <w:r>
         <w:rPr>
-          <w:sz w:val="24"/>
-          <w:szCs w:val="24"/>
-        </w:rPr>
-      </w:r>
-    </w:p>
-    <w:p>
-      <w:pPr>
-        <w:pStyle w:val="PreformattedText"/>
-        <w:bidi w:val="0"/>
-        <w:spacing w:before="0" w:after="0"/>
-        <w:jc w:val="left"/>
-        <w:rPr>
           <w:color w:val="2A6099"/>
           <w:sz w:val="28"/>
           <w:szCs w:val="28"/>
         </w:rPr>
-      </w:pPr>
-      <w:r>
+      </w:r>
+    </w:p>
+    <w:p>
+      <w:pPr>
+        <w:pStyle w:val="PreformattedText"/>
+        <w:bidi w:val="0"/>
+        <w:spacing w:before="0" w:after="0"/>
+        <w:jc w:val="left"/>
         <w:rPr>
           <w:color w:val="2A6099"/>
           <w:sz w:val="28"/>
           <w:szCs w:val="28"/>
         </w:rPr>
+      </w:pPr>
+      <w:r>
+        <w:rPr>
+          <w:color w:val="2A6099"/>
+          <w:sz w:val="28"/>
+          <w:szCs w:val="28"/>
+        </w:rPr>
+      </w:r>
+    </w:p>
+    <w:p>
+      <w:pPr>
+        <w:pStyle w:val="PreformattedText"/>
+        <w:bidi w:val="0"/>
+        <w:spacing w:before="0" w:after="0"/>
+        <w:jc w:val="left"/>
+        <w:rPr>
+          <w:color w:val="2A6099"/>
+          <w:sz w:val="28"/>
+          <w:szCs w:val="28"/>
+        </w:rPr>
+      </w:pPr>
+      <w:r>
+        <w:rPr>
+          <w:color w:val="2A6099"/>
+          <w:sz w:val="28"/>
+          <w:szCs w:val="28"/>
+        </w:rPr>
+      </w:r>
+    </w:p>
+    <w:p>
+      <w:pPr>
+        <w:pStyle w:val="PreformattedText"/>
+        <w:bidi w:val="0"/>
+        <w:spacing w:before="0" w:after="0"/>
+        <w:jc w:val="left"/>
+        <w:rPr>
+          <w:color w:val="2A6099"/>
+          <w:sz w:val="28"/>
+          <w:szCs w:val="28"/>
+        </w:rPr>
+      </w:pPr>
+      <w:r>
+        <w:rPr>
+          <w:color w:val="2A6099"/>
+          <w:sz w:val="28"/>
+          <w:szCs w:val="28"/>
+        </w:rPr>
+      </w:r>
+    </w:p>
+    <w:p>
+      <w:pPr>
+        <w:pStyle w:val="PreformattedText"/>
+        <w:bidi w:val="0"/>
+        <w:spacing w:before="0" w:after="0"/>
+        <w:jc w:val="left"/>
+        <w:rPr>
+          <w:color w:val="2A6099"/>
+          <w:sz w:val="28"/>
+          <w:szCs w:val="28"/>
+        </w:rPr>
+      </w:pPr>
+      <w:r>
+        <w:rPr>
+          <w:color w:val="2A6099"/>
+          <w:sz w:val="28"/>
+          <w:szCs w:val="28"/>
+        </w:rPr>
+      </w:r>
+    </w:p>
+    <w:p>
+      <w:pPr>
+        <w:pStyle w:val="PreformattedText"/>
+        <w:bidi w:val="0"/>
+        <w:spacing w:before="0" w:after="0"/>
+        <w:jc w:val="left"/>
+        <w:rPr>
+          <w:color w:val="2A6099"/>
+          <w:sz w:val="28"/>
+          <w:szCs w:val="28"/>
+        </w:rPr>
+      </w:pPr>
+      <w:r>
+        <w:rPr>
+          <w:color w:val="2A6099"/>
+          <w:sz w:val="28"/>
+          <w:szCs w:val="28"/>
+        </w:rPr>
         <w:t>Output</w:t>
       </w:r>
     </w:p>
@@ -8426,7 +8253,7 @@
           <w:sz w:val="24"/>
           <w:szCs w:val="24"/>
         </w:rPr>
-        <w:t>Each row in the report should correspond to one answer-key artifact row and contain:</w:t>
+        <w:t>Each row in the report should correspond to one answer-key artifact row and contain the results from its matched prediction, or zero-valued unanswered results when no prediction matched that answer-key row:</w:t>
       </w:r>
     </w:p>
     <w:p>
@@ -8467,7 +8294,7 @@
     </w:p>
     <w:tbl>
       <w:tblPr>
-        <w:tblW w:w="5000" w:type="pct"/>
+        <w:tblW w:w="9636" w:type="dxa"/>
         <w:jc w:val="left"/>
         <w:tblInd w:w="55" w:type="dxa"/>
         <w:tblLayout w:type="fixed"/>
@@ -8479,17 +8306,16 @@
         </w:tblCellMar>
       </w:tblPr>
       <w:tblGrid>
-        <w:gridCol w:w="1925"/>
-        <w:gridCol w:w="1930"/>
-        <w:gridCol w:w="1925"/>
-        <w:gridCol w:w="1930"/>
-        <w:gridCol w:w="1928"/>
+        <w:gridCol w:w="2217"/>
+        <w:gridCol w:w="2604"/>
+        <w:gridCol w:w="2612"/>
+        <w:gridCol w:w="2203"/>
       </w:tblGrid>
       <w:tr>
         <w:trPr/>
         <w:tc>
           <w:tcPr>
-            <w:tcW w:w="1925" w:type="dxa"/>
+            <w:tcW w:w="2217" w:type="dxa"/>
             <w:tcBorders>
               <w:top w:val="single" w:sz="4" w:space="0" w:color="000000"/>
               <w:left w:val="single" w:sz="4" w:space="0" w:color="000000"/>
@@ -8520,40 +8346,13 @@
                 <w:szCs w:val="24"/>
                 <w:u w:val="none"/>
               </w:rPr>
-              <w:t>Row/Data</w:t>
-            </w:r>
-          </w:p>
-          <w:p>
-            <w:pPr>
-              <w:pStyle w:val="TableContents"/>
-              <w:jc w:val="center"/>
-              <w:rPr>
-                <w:sz w:val="24"/>
-                <w:szCs w:val="24"/>
-              </w:rPr>
-            </w:pPr>
-            <w:r>
-              <w:rPr>
-                <w:b/>
-                <w:bCs/>
-                <w:i w:val="false"/>
-                <w:iCs w:val="false"/>
-                <w:strike w:val="false"/>
-                <w:dstrike w:val="false"/>
-                <w:outline w:val="false"/>
-                <w:shadow w:val="false"/>
-                <w:color w:val="000000"/>
-                <w:sz w:val="24"/>
-                <w:szCs w:val="24"/>
-                <w:u w:val="none"/>
-              </w:rPr>
-              <w:t>ID</w:t>
+              <w:t>Point</w:t>
             </w:r>
           </w:p>
         </w:tc>
         <w:tc>
           <w:tcPr>
-            <w:tcW w:w="1930" w:type="dxa"/>
+            <w:tcW w:w="2604" w:type="dxa"/>
             <w:tcBorders>
               <w:top w:val="single" w:sz="4" w:space="0" w:color="000000"/>
               <w:left w:val="single" w:sz="4" w:space="0" w:color="000000"/>
@@ -8584,13 +8383,40 @@
                 <w:szCs w:val="24"/>
                 <w:u w:val="none"/>
               </w:rPr>
-              <w:t>Point</w:t>
+              <w:t>Interval</w:t>
+            </w:r>
+          </w:p>
+          <w:p>
+            <w:pPr>
+              <w:pStyle w:val="TableContents"/>
+              <w:jc w:val="center"/>
+              <w:rPr>
+                <w:sz w:val="24"/>
+                <w:szCs w:val="24"/>
+              </w:rPr>
+            </w:pPr>
+            <w:r>
+              <w:rPr>
+                <w:b/>
+                <w:bCs/>
+                <w:i w:val="false"/>
+                <w:iCs w:val="false"/>
+                <w:strike w:val="false"/>
+                <w:dstrike w:val="false"/>
+                <w:outline w:val="false"/>
+                <w:shadow w:val="false"/>
+                <w:color w:val="000000"/>
+                <w:sz w:val="24"/>
+                <w:szCs w:val="24"/>
+                <w:u w:val="none"/>
+              </w:rPr>
+              <w:t>Accuracy</w:t>
             </w:r>
           </w:p>
         </w:tc>
         <w:tc>
           <w:tcPr>
-            <w:tcW w:w="1925" w:type="dxa"/>
+            <w:tcW w:w="2612" w:type="dxa"/>
             <w:tcBorders>
               <w:top w:val="single" w:sz="4" w:space="0" w:color="000000"/>
               <w:left w:val="single" w:sz="4" w:space="0" w:color="000000"/>
@@ -8621,77 +8447,13 @@
                 <w:szCs w:val="24"/>
                 <w:u w:val="none"/>
               </w:rPr>
-              <w:t>Interval</w:t>
-            </w:r>
-          </w:p>
-          <w:p>
-            <w:pPr>
-              <w:pStyle w:val="TableContents"/>
-              <w:jc w:val="center"/>
-              <w:rPr>
-                <w:sz w:val="24"/>
-                <w:szCs w:val="24"/>
-              </w:rPr>
-            </w:pPr>
-            <w:r>
-              <w:rPr>
-                <w:b/>
-                <w:bCs/>
-                <w:i w:val="false"/>
-                <w:iCs w:val="false"/>
-                <w:strike w:val="false"/>
-                <w:dstrike w:val="false"/>
-                <w:outline w:val="false"/>
-                <w:shadow w:val="false"/>
-                <w:color w:val="000000"/>
-                <w:sz w:val="24"/>
-                <w:szCs w:val="24"/>
-                <w:u w:val="none"/>
-              </w:rPr>
-              <w:t>Accuracy</w:t>
-            </w:r>
-          </w:p>
-        </w:tc>
-        <w:tc>
-          <w:tcPr>
-            <w:tcW w:w="1930" w:type="dxa"/>
-            <w:tcBorders>
-              <w:top w:val="single" w:sz="4" w:space="0" w:color="000000"/>
-              <w:left w:val="single" w:sz="4" w:space="0" w:color="000000"/>
-              <w:bottom w:val="single" w:sz="4" w:space="0" w:color="000000"/>
-            </w:tcBorders>
-          </w:tcPr>
-          <w:p>
-            <w:pPr>
-              <w:pStyle w:val="TableContents"/>
-              <w:jc w:val="center"/>
-              <w:rPr>
-                <w:sz w:val="24"/>
-                <w:szCs w:val="24"/>
-              </w:rPr>
-            </w:pPr>
-            <w:r>
-              <w:rPr>
-                <w:b/>
-                <w:bCs/>
-                <w:i w:val="false"/>
-                <w:iCs w:val="false"/>
-                <w:strike w:val="false"/>
-                <w:dstrike w:val="false"/>
-                <w:outline w:val="false"/>
-                <w:shadow w:val="false"/>
-                <w:color w:val="000000"/>
-                <w:sz w:val="24"/>
-                <w:szCs w:val="24"/>
-                <w:u w:val="none"/>
-              </w:rPr>
               <w:t>Category Accuracy</w:t>
             </w:r>
           </w:p>
         </w:tc>
         <w:tc>
           <w:tcPr>
-            <w:tcW w:w="1928" w:type="dxa"/>
+            <w:tcW w:w="2203" w:type="dxa"/>
             <w:tcBorders>
               <w:top w:val="single" w:sz="4" w:space="0" w:color="000000"/>
               <w:left w:val="single" w:sz="4" w:space="0" w:color="000000"/>
@@ -8759,7 +8521,7 @@
         <w:trPr/>
         <w:tc>
           <w:tcPr>
-            <w:tcW w:w="1925" w:type="dxa"/>
+            <w:tcW w:w="2217" w:type="dxa"/>
             <w:tcBorders>
               <w:left w:val="single" w:sz="4" w:space="0" w:color="000000"/>
               <w:bottom w:val="single" w:sz="4" w:space="0" w:color="000000"/>
@@ -8789,13 +8551,13 @@
                 <w:szCs w:val="24"/>
                 <w:u w:val="none"/>
               </w:rPr>
-              <w:t>1</w:t>
+              <w:t>17.4</w:t>
             </w:r>
           </w:p>
         </w:tc>
         <w:tc>
           <w:tcPr>
-            <w:tcW w:w="1930" w:type="dxa"/>
+            <w:tcW w:w="2604" w:type="dxa"/>
             <w:tcBorders>
               <w:left w:val="single" w:sz="4" w:space="0" w:color="000000"/>
               <w:bottom w:val="single" w:sz="4" w:space="0" w:color="000000"/>
@@ -8825,13 +8587,13 @@
                 <w:szCs w:val="24"/>
                 <w:u w:val="none"/>
               </w:rPr>
-              <w:t>17.4</w:t>
+              <w:t>0.84</w:t>
             </w:r>
           </w:p>
         </w:tc>
         <w:tc>
           <w:tcPr>
-            <w:tcW w:w="1925" w:type="dxa"/>
+            <w:tcW w:w="2612" w:type="dxa"/>
             <w:tcBorders>
               <w:left w:val="single" w:sz="4" w:space="0" w:color="000000"/>
               <w:bottom w:val="single" w:sz="4" w:space="0" w:color="000000"/>
@@ -8861,49 +8623,13 @@
                 <w:szCs w:val="24"/>
                 <w:u w:val="none"/>
               </w:rPr>
-              <w:t>0.84</w:t>
-            </w:r>
-          </w:p>
-        </w:tc>
-        <w:tc>
-          <w:tcPr>
-            <w:tcW w:w="1930" w:type="dxa"/>
-            <w:tcBorders>
-              <w:left w:val="single" w:sz="4" w:space="0" w:color="000000"/>
-              <w:bottom w:val="single" w:sz="4" w:space="0" w:color="000000"/>
-            </w:tcBorders>
-          </w:tcPr>
-          <w:p>
-            <w:pPr>
-              <w:pStyle w:val="TableContents"/>
-              <w:jc w:val="center"/>
-              <w:rPr>
-                <w:sz w:val="24"/>
-                <w:szCs w:val="24"/>
-              </w:rPr>
-            </w:pPr>
-            <w:r>
-              <w:rPr>
-                <w:b w:val="false"/>
-                <w:bCs w:val="false"/>
-                <w:i w:val="false"/>
-                <w:iCs w:val="false"/>
-                <w:strike w:val="false"/>
-                <w:dstrike w:val="false"/>
-                <w:outline w:val="false"/>
-                <w:shadow w:val="false"/>
-                <w:color w:val="000000"/>
-                <w:sz w:val="24"/>
-                <w:szCs w:val="24"/>
-                <w:u w:val="none"/>
-              </w:rPr>
               <w:t>1</w:t>
             </w:r>
           </w:p>
         </w:tc>
         <w:tc>
           <w:tcPr>
-            <w:tcW w:w="1928" w:type="dxa"/>
+            <w:tcW w:w="2203" w:type="dxa"/>
             <w:tcBorders>
               <w:left w:val="single" w:sz="4" w:space="0" w:color="000000"/>
               <w:bottom w:val="single" w:sz="4" w:space="0" w:color="000000"/>
@@ -8943,7 +8669,7 @@
         <w:trPr/>
         <w:tc>
           <w:tcPr>
-            <w:tcW w:w="1925" w:type="dxa"/>
+            <w:tcW w:w="2217" w:type="dxa"/>
             <w:tcBorders>
               <w:left w:val="single" w:sz="4" w:space="0" w:color="000000"/>
               <w:bottom w:val="single" w:sz="4" w:space="0" w:color="000000"/>
@@ -8973,13 +8699,13 @@
                 <w:szCs w:val="24"/>
                 <w:u w:val="none"/>
               </w:rPr>
-              <w:t>2</w:t>
+              <w:t>9.2</w:t>
             </w:r>
           </w:p>
         </w:tc>
         <w:tc>
           <w:tcPr>
-            <w:tcW w:w="1930" w:type="dxa"/>
+            <w:tcW w:w="2604" w:type="dxa"/>
             <w:tcBorders>
               <w:left w:val="single" w:sz="4" w:space="0" w:color="000000"/>
               <w:bottom w:val="single" w:sz="4" w:space="0" w:color="000000"/>
@@ -9009,13 +8735,13 @@
                 <w:szCs w:val="24"/>
                 <w:u w:val="none"/>
               </w:rPr>
-              <w:t>9.2</w:t>
+              <w:t>0.62</w:t>
             </w:r>
           </w:p>
         </w:tc>
         <w:tc>
           <w:tcPr>
-            <w:tcW w:w="1925" w:type="dxa"/>
+            <w:tcW w:w="2612" w:type="dxa"/>
             <w:tcBorders>
               <w:left w:val="single" w:sz="4" w:space="0" w:color="000000"/>
               <w:bottom w:val="single" w:sz="4" w:space="0" w:color="000000"/>
@@ -9045,49 +8771,13 @@
                 <w:szCs w:val="24"/>
                 <w:u w:val="none"/>
               </w:rPr>
-              <w:t>0.62</w:t>
-            </w:r>
-          </w:p>
-        </w:tc>
-        <w:tc>
-          <w:tcPr>
-            <w:tcW w:w="1930" w:type="dxa"/>
-            <w:tcBorders>
-              <w:left w:val="single" w:sz="4" w:space="0" w:color="000000"/>
-              <w:bottom w:val="single" w:sz="4" w:space="0" w:color="000000"/>
-            </w:tcBorders>
-          </w:tcPr>
-          <w:p>
-            <w:pPr>
-              <w:pStyle w:val="TableContents"/>
-              <w:jc w:val="center"/>
-              <w:rPr>
-                <w:sz w:val="24"/>
-                <w:szCs w:val="24"/>
-              </w:rPr>
-            </w:pPr>
-            <w:r>
-              <w:rPr>
-                <w:b w:val="false"/>
-                <w:bCs w:val="false"/>
-                <w:i w:val="false"/>
-                <w:iCs w:val="false"/>
-                <w:strike w:val="false"/>
-                <w:dstrike w:val="false"/>
-                <w:outline w:val="false"/>
-                <w:shadow w:val="false"/>
-                <w:color w:val="000000"/>
-                <w:sz w:val="24"/>
-                <w:szCs w:val="24"/>
-                <w:u w:val="none"/>
-              </w:rPr>
               <w:t>1</w:t>
             </w:r>
           </w:p>
         </w:tc>
         <w:tc>
           <w:tcPr>
-            <w:tcW w:w="1928" w:type="dxa"/>
+            <w:tcW w:w="2203" w:type="dxa"/>
             <w:tcBorders>
               <w:left w:val="single" w:sz="4" w:space="0" w:color="000000"/>
               <w:bottom w:val="single" w:sz="4" w:space="0" w:color="000000"/>
@@ -9127,7 +8817,7 @@
         <w:trPr/>
         <w:tc>
           <w:tcPr>
-            <w:tcW w:w="1925" w:type="dxa"/>
+            <w:tcW w:w="2217" w:type="dxa"/>
             <w:tcBorders>
               <w:left w:val="single" w:sz="4" w:space="0" w:color="000000"/>
               <w:bottom w:val="single" w:sz="4" w:space="0" w:color="000000"/>
@@ -9157,13 +8847,13 @@
                 <w:szCs w:val="24"/>
                 <w:u w:val="none"/>
               </w:rPr>
-              <w:t>3</w:t>
+              <w:t>0.0</w:t>
             </w:r>
           </w:p>
         </w:tc>
         <w:tc>
           <w:tcPr>
-            <w:tcW w:w="1930" w:type="dxa"/>
+            <w:tcW w:w="2604" w:type="dxa"/>
             <w:tcBorders>
               <w:left w:val="single" w:sz="4" w:space="0" w:color="000000"/>
               <w:bottom w:val="single" w:sz="4" w:space="0" w:color="000000"/>
@@ -9193,13 +8883,13 @@
                 <w:szCs w:val="24"/>
                 <w:u w:val="none"/>
               </w:rPr>
-              <w:t>0.0</w:t>
+              <w:t>0.00</w:t>
             </w:r>
           </w:p>
         </w:tc>
         <w:tc>
           <w:tcPr>
-            <w:tcW w:w="1925" w:type="dxa"/>
+            <w:tcW w:w="2612" w:type="dxa"/>
             <w:tcBorders>
               <w:left w:val="single" w:sz="4" w:space="0" w:color="000000"/>
               <w:bottom w:val="single" w:sz="4" w:space="0" w:color="000000"/>
@@ -9229,49 +8919,13 @@
                 <w:szCs w:val="24"/>
                 <w:u w:val="none"/>
               </w:rPr>
-              <w:t>0.00</w:t>
-            </w:r>
-          </w:p>
-        </w:tc>
-        <w:tc>
-          <w:tcPr>
-            <w:tcW w:w="1930" w:type="dxa"/>
-            <w:tcBorders>
-              <w:left w:val="single" w:sz="4" w:space="0" w:color="000000"/>
-              <w:bottom w:val="single" w:sz="4" w:space="0" w:color="000000"/>
-            </w:tcBorders>
-          </w:tcPr>
-          <w:p>
-            <w:pPr>
-              <w:pStyle w:val="TableContents"/>
-              <w:jc w:val="center"/>
-              <w:rPr>
-                <w:sz w:val="24"/>
-                <w:szCs w:val="24"/>
-              </w:rPr>
-            </w:pPr>
-            <w:r>
-              <w:rPr>
-                <w:b w:val="false"/>
-                <w:bCs w:val="false"/>
-                <w:i w:val="false"/>
-                <w:iCs w:val="false"/>
-                <w:strike w:val="false"/>
-                <w:dstrike w:val="false"/>
-                <w:outline w:val="false"/>
-                <w:shadow w:val="false"/>
-                <w:color w:val="000000"/>
-                <w:sz w:val="24"/>
-                <w:szCs w:val="24"/>
-                <w:u w:val="none"/>
-              </w:rPr>
               <w:t>0</w:t>
             </w:r>
           </w:p>
         </w:tc>
         <w:tc>
           <w:tcPr>
-            <w:tcW w:w="1928" w:type="dxa"/>
+            <w:tcW w:w="2203" w:type="dxa"/>
             <w:tcBorders>
               <w:left w:val="single" w:sz="4" w:space="0" w:color="000000"/>
               <w:bottom w:val="single" w:sz="4" w:space="0" w:color="000000"/>
@@ -9475,17 +9129,17 @@
         </w:tblCellMar>
       </w:tblPr>
       <w:tblGrid>
-        <w:gridCol w:w="1925"/>
-        <w:gridCol w:w="1930"/>
-        <w:gridCol w:w="1925"/>
-        <w:gridCol w:w="1930"/>
+        <w:gridCol w:w="1924"/>
+        <w:gridCol w:w="1931"/>
+        <w:gridCol w:w="1924"/>
+        <w:gridCol w:w="1931"/>
         <w:gridCol w:w="1928"/>
       </w:tblGrid>
       <w:tr>
         <w:trPr/>
         <w:tc>
           <w:tcPr>
-            <w:tcW w:w="1925" w:type="dxa"/>
+            <w:tcW w:w="1924" w:type="dxa"/>
             <w:tcBorders>
               <w:top w:val="single" w:sz="4" w:space="0" w:color="000000"/>
               <w:left w:val="single" w:sz="4" w:space="0" w:color="000000"/>
@@ -9549,7 +9203,7 @@
         </w:tc>
         <w:tc>
           <w:tcPr>
-            <w:tcW w:w="1930" w:type="dxa"/>
+            <w:tcW w:w="1931" w:type="dxa"/>
             <w:tcBorders>
               <w:top w:val="single" w:sz="4" w:space="0" w:color="000000"/>
               <w:left w:val="single" w:sz="4" w:space="0" w:color="000000"/>
@@ -9613,7 +9267,7 @@
         </w:tc>
         <w:tc>
           <w:tcPr>
-            <w:tcW w:w="1925" w:type="dxa"/>
+            <w:tcW w:w="1924" w:type="dxa"/>
             <w:tcBorders>
               <w:top w:val="single" w:sz="4" w:space="0" w:color="000000"/>
               <w:left w:val="single" w:sz="4" w:space="0" w:color="000000"/>
@@ -9650,7 +9304,7 @@
         </w:tc>
         <w:tc>
           <w:tcPr>
-            <w:tcW w:w="1930" w:type="dxa"/>
+            <w:tcW w:w="1931" w:type="dxa"/>
             <w:tcBorders>
               <w:top w:val="single" w:sz="4" w:space="0" w:color="000000"/>
               <w:left w:val="single" w:sz="4" w:space="0" w:color="000000"/>
@@ -9782,7 +9436,7 @@
         <w:trPr/>
         <w:tc>
           <w:tcPr>
-            <w:tcW w:w="1925" w:type="dxa"/>
+            <w:tcW w:w="1924" w:type="dxa"/>
             <w:tcBorders>
               <w:left w:val="single" w:sz="4" w:space="0" w:color="000000"/>
               <w:bottom w:val="single" w:sz="4" w:space="0" w:color="000000"/>
@@ -9818,7 +9472,7 @@
         </w:tc>
         <w:tc>
           <w:tcPr>
-            <w:tcW w:w="1930" w:type="dxa"/>
+            <w:tcW w:w="1931" w:type="dxa"/>
             <w:tcBorders>
               <w:left w:val="single" w:sz="4" w:space="0" w:color="000000"/>
               <w:bottom w:val="single" w:sz="4" w:space="0" w:color="000000"/>
@@ -9854,7 +9508,7 @@
         </w:tc>
         <w:tc>
           <w:tcPr>
-            <w:tcW w:w="1925" w:type="dxa"/>
+            <w:tcW w:w="1924" w:type="dxa"/>
             <w:tcBorders>
               <w:left w:val="single" w:sz="4" w:space="0" w:color="000000"/>
               <w:bottom w:val="single" w:sz="4" w:space="0" w:color="000000"/>
@@ -9890,7 +9544,7 @@
         </w:tc>
         <w:tc>
           <w:tcPr>
-            <w:tcW w:w="1930" w:type="dxa"/>
+            <w:tcW w:w="1931" w:type="dxa"/>
             <w:tcBorders>
               <w:left w:val="single" w:sz="4" w:space="0" w:color="000000"/>
               <w:bottom w:val="single" w:sz="4" w:space="0" w:color="000000"/>

</xml_diff>